<commit_message>
ELEC study rev 2: disclosed Q1-26 P&L lines + FY25 facilities (10.9bn) replace derived anchors; full rebuild & re-reconciliation
Co-Authored-By: Claude Fable 5 <noreply@anthropic.com>
Claude-Session: https://claude.ai/code/session_01WDB3U7m8U6NX4ju3RCn348
</commit_message>
<xml_diff>
--- a/engine/elec_study/ELEC_Source_Register_05-08-2026.docx
+++ b/engine/elec_study/ELEC_Source_Register_05-08-2026.docx
@@ -476,7 +476,7 @@
                 <w:color w:val="1C3A36"/>
                 <w:sz w:val="18"/>
               </w:rPr>
-              <w:t>22 records</w:t>
+              <w:t>30 records</w:t>
             </w:r>
           </w:p>
         </w:tc>
@@ -2487,7 +2487,7 @@
           <w:color w:val="1C3A36"/>
           <w:sz w:val="22"/>
         </w:rPr>
-        <w:t>C.4  Ring: Company  (22 records)</w:t>
+        <w:t>C.4  Ring: Company  (30 records)</w:t>
       </w:r>
     </w:p>
     <w:tbl>
@@ -4054,6 +4054,566 @@
                 <w:sz w:val="15"/>
               </w:rPr>
               <w:t>Simply Wall St health page (total liabilities)</w:t>
+            </w:r>
+          </w:p>
+        </w:tc>
+      </w:tr>
+      <w:tr>
+        <w:tc>
+          <w:tcPr>
+            <w:tcW w:type="dxa" w:w="1800"/>
+          </w:tcPr>
+          <w:p>
+            <w:pPr>
+              <w:spacing w:after="20"/>
+            </w:pPr>
+            <w:r>
+              <w:rPr>
+                <w:color w:val="1C3A36"/>
+                <w:sz w:val="15"/>
+              </w:rPr>
+              <w:t>debt_fy25</w:t>
+            </w:r>
+          </w:p>
+        </w:tc>
+        <w:tc>
+          <w:tcPr>
+            <w:tcW w:type="dxa" w:w="1656"/>
+          </w:tcPr>
+          <w:p>
+            <w:pPr>
+              <w:spacing w:after="20"/>
+            </w:pPr>
+            <w:r>
+              <w:rPr>
+                <w:color w:val="1C3A36"/>
+                <w:sz w:val="15"/>
+              </w:rPr>
+              <w:t>10,900</w:t>
+            </w:r>
+          </w:p>
+        </w:tc>
+        <w:tc>
+          <w:tcPr>
+            <w:tcW w:type="dxa" w:w="1224"/>
+          </w:tcPr>
+          <w:p>
+            <w:pPr>
+              <w:spacing w:after="20"/>
+            </w:pPr>
+            <w:r>
+              <w:rPr>
+                <w:color w:val="1C3A36"/>
+                <w:sz w:val="15"/>
+              </w:rPr>
+              <w:t>2026-03-18</w:t>
+            </w:r>
+          </w:p>
+        </w:tc>
+        <w:tc>
+          <w:tcPr>
+            <w:tcW w:type="dxa" w:w="5544"/>
+          </w:tcPr>
+          <w:p>
+            <w:pPr>
+              <w:spacing w:after="20"/>
+            </w:pPr>
+            <w:r>
+              <w:rPr>
+                <w:color w:val="1C3A36"/>
+                <w:sz w:val="15"/>
+              </w:rPr>
+              <w:t>Bank credit facilities held at end-2025: 'obtained credit facilities of EGP 10.9bn during 2025 vs 8.96bn in 2024, from several local banks' (almalnews/amwalalghad FY25 results coverage of the EGX filing). Read as the drawn year-end balance because the 2024 comparative (8.96bn) matches the FY24 balance-sheet debt print (~9.0bn, SWS) almost exactly; interpretation flagged and the FY24-vintage alternative shown in sensitivity</w:t>
+            </w:r>
+          </w:p>
+        </w:tc>
+      </w:tr>
+      <w:tr>
+        <w:tc>
+          <w:tcPr>
+            <w:tcW w:type="dxa" w:w="1800"/>
+          </w:tcPr>
+          <w:p>
+            <w:pPr>
+              <w:spacing w:after="20"/>
+            </w:pPr>
+            <w:r>
+              <w:rPr>
+                <w:color w:val="1C3A36"/>
+                <w:sz w:val="15"/>
+              </w:rPr>
+              <w:t>q1_26_cogs</w:t>
+            </w:r>
+          </w:p>
+        </w:tc>
+        <w:tc>
+          <w:tcPr>
+            <w:tcW w:type="dxa" w:w="1656"/>
+          </w:tcPr>
+          <w:p>
+            <w:pPr>
+              <w:spacing w:after="20"/>
+            </w:pPr>
+            <w:r>
+              <w:rPr>
+                <w:color w:val="1C3A36"/>
+                <w:sz w:val="15"/>
+              </w:rPr>
+              <w:t>1,975</w:t>
+            </w:r>
+          </w:p>
+        </w:tc>
+        <w:tc>
+          <w:tcPr>
+            <w:tcW w:type="dxa" w:w="1224"/>
+          </w:tcPr>
+          <w:p>
+            <w:pPr>
+              <w:spacing w:after="20"/>
+            </w:pPr>
+            <w:r>
+              <w:rPr>
+                <w:color w:val="1C3A36"/>
+                <w:sz w:val="15"/>
+              </w:rPr>
+              <w:t>2026-06-30</w:t>
+            </w:r>
+          </w:p>
+        </w:tc>
+        <w:tc>
+          <w:tcPr>
+            <w:tcW w:type="dxa" w:w="5544"/>
+          </w:tcPr>
+          <w:p>
+            <w:pPr>
+              <w:spacing w:after="20"/>
+            </w:pPr>
+            <w:r>
+              <w:rPr>
+                <w:color w:val="1C3A36"/>
+                <w:sz w:val="15"/>
+              </w:rPr>
+              <w:t>Q1-2026 cost of sales (almalnews/alborsaanews/hapijournal, 30-Jun-2026, of the EGX interim filing)</w:t>
+            </w:r>
+          </w:p>
+        </w:tc>
+      </w:tr>
+      <w:tr>
+        <w:tc>
+          <w:tcPr>
+            <w:tcW w:type="dxa" w:w="1800"/>
+          </w:tcPr>
+          <w:p>
+            <w:pPr>
+              <w:spacing w:after="20"/>
+            </w:pPr>
+            <w:r>
+              <w:rPr>
+                <w:color w:val="1C3A36"/>
+                <w:sz w:val="15"/>
+              </w:rPr>
+              <w:t>q1_26_gp</w:t>
+            </w:r>
+          </w:p>
+        </w:tc>
+        <w:tc>
+          <w:tcPr>
+            <w:tcW w:type="dxa" w:w="1656"/>
+          </w:tcPr>
+          <w:p>
+            <w:pPr>
+              <w:spacing w:after="20"/>
+            </w:pPr>
+            <w:r>
+              <w:rPr>
+                <w:color w:val="1C3A36"/>
+                <w:sz w:val="15"/>
+              </w:rPr>
+              <w:t>119.1</w:t>
+            </w:r>
+          </w:p>
+        </w:tc>
+        <w:tc>
+          <w:tcPr>
+            <w:tcW w:type="dxa" w:w="1224"/>
+          </w:tcPr>
+          <w:p>
+            <w:pPr>
+              <w:spacing w:after="20"/>
+            </w:pPr>
+            <w:r>
+              <w:rPr>
+                <w:color w:val="1C3A36"/>
+                <w:sz w:val="15"/>
+              </w:rPr>
+              <w:t>2026-06-30</w:t>
+            </w:r>
+          </w:p>
+        </w:tc>
+        <w:tc>
+          <w:tcPr>
+            <w:tcW w:type="dxa" w:w="5544"/>
+          </w:tcPr>
+          <w:p>
+            <w:pPr>
+              <w:spacing w:after="20"/>
+            </w:pPr>
+            <w:r>
+              <w:rPr>
+                <w:color w:val="1C3A36"/>
+                <w:sz w:val="15"/>
+              </w:rPr>
+              <w:t>Q1-2026 gross profit — 5.7% margin vs 33.1% in Q1-25 (same sources)</w:t>
+            </w:r>
+          </w:p>
+        </w:tc>
+      </w:tr>
+      <w:tr>
+        <w:tc>
+          <w:tcPr>
+            <w:tcW w:type="dxa" w:w="1800"/>
+          </w:tcPr>
+          <w:p>
+            <w:pPr>
+              <w:spacing w:after="20"/>
+            </w:pPr>
+            <w:r>
+              <w:rPr>
+                <w:color w:val="1C3A36"/>
+                <w:sz w:val="15"/>
+              </w:rPr>
+              <w:t>q1_26_op</w:t>
+            </w:r>
+          </w:p>
+        </w:tc>
+        <w:tc>
+          <w:tcPr>
+            <w:tcW w:type="dxa" w:w="1656"/>
+          </w:tcPr>
+          <w:p>
+            <w:pPr>
+              <w:spacing w:after="20"/>
+            </w:pPr>
+            <w:r>
+              <w:rPr>
+                <w:color w:val="1C3A36"/>
+                <w:sz w:val="15"/>
+              </w:rPr>
+              <w:t>1.429</w:t>
+            </w:r>
+          </w:p>
+        </w:tc>
+        <w:tc>
+          <w:tcPr>
+            <w:tcW w:type="dxa" w:w="1224"/>
+          </w:tcPr>
+          <w:p>
+            <w:pPr>
+              <w:spacing w:after="20"/>
+            </w:pPr>
+            <w:r>
+              <w:rPr>
+                <w:color w:val="1C3A36"/>
+                <w:sz w:val="15"/>
+              </w:rPr>
+              <w:t>2026-06-30</w:t>
+            </w:r>
+          </w:p>
+        </w:tc>
+        <w:tc>
+          <w:tcPr>
+            <w:tcW w:type="dxa" w:w="5544"/>
+          </w:tcPr>
+          <w:p>
+            <w:pPr>
+              <w:spacing w:after="20"/>
+            </w:pPr>
+            <w:r>
+              <w:rPr>
+                <w:color w:val="1C3A36"/>
+                <w:sz w:val="15"/>
+              </w:rPr>
+              <w:t>Q1-2026 operating profit — essentially zero (same sources)</w:t>
+            </w:r>
+          </w:p>
+        </w:tc>
+      </w:tr>
+      <w:tr>
+        <w:tc>
+          <w:tcPr>
+            <w:tcW w:type="dxa" w:w="1800"/>
+          </w:tcPr>
+          <w:p>
+            <w:pPr>
+              <w:spacing w:after="20"/>
+            </w:pPr>
+            <w:r>
+              <w:rPr>
+                <w:color w:val="1C3A36"/>
+                <w:sz w:val="15"/>
+              </w:rPr>
+              <w:t>q1_25_gp</w:t>
+            </w:r>
+          </w:p>
+        </w:tc>
+        <w:tc>
+          <w:tcPr>
+            <w:tcW w:type="dxa" w:w="1656"/>
+          </w:tcPr>
+          <w:p>
+            <w:pPr>
+              <w:spacing w:after="20"/>
+            </w:pPr>
+            <w:r>
+              <w:rPr>
+                <w:color w:val="1C3A36"/>
+                <w:sz w:val="15"/>
+              </w:rPr>
+              <w:t>1,233</w:t>
+            </w:r>
+          </w:p>
+        </w:tc>
+        <w:tc>
+          <w:tcPr>
+            <w:tcW w:type="dxa" w:w="1224"/>
+          </w:tcPr>
+          <w:p>
+            <w:pPr>
+              <w:spacing w:after="20"/>
+            </w:pPr>
+            <w:r>
+              <w:rPr>
+                <w:color w:val="1C3A36"/>
+                <w:sz w:val="15"/>
+              </w:rPr>
+              <w:t>2026-06-30</w:t>
+            </w:r>
+          </w:p>
+        </w:tc>
+        <w:tc>
+          <w:tcPr>
+            <w:tcW w:type="dxa" w:w="5544"/>
+          </w:tcPr>
+          <w:p>
+            <w:pPr>
+              <w:spacing w:after="20"/>
+            </w:pPr>
+            <w:r>
+              <w:rPr>
+                <w:color w:val="1C3A36"/>
+                <w:sz w:val="15"/>
+              </w:rPr>
+              <w:t>Q1-2025 gross profit comparative (same sources)</w:t>
+            </w:r>
+          </w:p>
+        </w:tc>
+      </w:tr>
+      <w:tr>
+        <w:tc>
+          <w:tcPr>
+            <w:tcW w:type="dxa" w:w="1800"/>
+          </w:tcPr>
+          <w:p>
+            <w:pPr>
+              <w:spacing w:after="20"/>
+            </w:pPr>
+            <w:r>
+              <w:rPr>
+                <w:color w:val="1C3A36"/>
+                <w:sz w:val="15"/>
+              </w:rPr>
+              <w:t>q1_25_op</w:t>
+            </w:r>
+          </w:p>
+        </w:tc>
+        <w:tc>
+          <w:tcPr>
+            <w:tcW w:type="dxa" w:w="1656"/>
+          </w:tcPr>
+          <w:p>
+            <w:pPr>
+              <w:spacing w:after="20"/>
+            </w:pPr>
+            <w:r>
+              <w:rPr>
+                <w:color w:val="1C3A36"/>
+                <w:sz w:val="15"/>
+              </w:rPr>
+              <w:t>1,124</w:t>
+            </w:r>
+          </w:p>
+        </w:tc>
+        <w:tc>
+          <w:tcPr>
+            <w:tcW w:type="dxa" w:w="1224"/>
+          </w:tcPr>
+          <w:p>
+            <w:pPr>
+              <w:spacing w:after="20"/>
+            </w:pPr>
+            <w:r>
+              <w:rPr>
+                <w:color w:val="1C3A36"/>
+                <w:sz w:val="15"/>
+              </w:rPr>
+              <w:t>2026-06-30</w:t>
+            </w:r>
+          </w:p>
+        </w:tc>
+        <w:tc>
+          <w:tcPr>
+            <w:tcW w:type="dxa" w:w="5544"/>
+          </w:tcPr>
+          <w:p>
+            <w:pPr>
+              <w:spacing w:after="20"/>
+            </w:pPr>
+            <w:r>
+              <w:rPr>
+                <w:color w:val="1C3A36"/>
+                <w:sz w:val="15"/>
+              </w:rPr>
+              <w:t>Q1-2025 operating profit comparative (same sources)</w:t>
+            </w:r>
+          </w:p>
+        </w:tc>
+      </w:tr>
+      <w:tr>
+        <w:tc>
+          <w:tcPr>
+            <w:tcW w:type="dxa" w:w="1800"/>
+          </w:tcPr>
+          <w:p>
+            <w:pPr>
+              <w:spacing w:after="20"/>
+            </w:pPr>
+            <w:r>
+              <w:rPr>
+                <w:color w:val="1C3A36"/>
+                <w:sz w:val="15"/>
+              </w:rPr>
+              <w:t>fy25_standalone_sales</w:t>
+            </w:r>
+          </w:p>
+        </w:tc>
+        <w:tc>
+          <w:tcPr>
+            <w:tcW w:type="dxa" w:w="1656"/>
+          </w:tcPr>
+          <w:p>
+            <w:pPr>
+              <w:spacing w:after="20"/>
+            </w:pPr>
+            <w:r>
+              <w:rPr>
+                <w:color w:val="1C3A36"/>
+                <w:sz w:val="15"/>
+              </w:rPr>
+              <w:t>4,700</w:t>
+            </w:r>
+          </w:p>
+        </w:tc>
+        <w:tc>
+          <w:tcPr>
+            <w:tcW w:type="dxa" w:w="1224"/>
+          </w:tcPr>
+          <w:p>
+            <w:pPr>
+              <w:spacing w:after="20"/>
+            </w:pPr>
+            <w:r>
+              <w:rPr>
+                <w:color w:val="1C3A36"/>
+                <w:sz w:val="15"/>
+              </w:rPr>
+              <w:t>2026-03</w:t>
+            </w:r>
+          </w:p>
+        </w:tc>
+        <w:tc>
+          <w:tcPr>
+            <w:tcW w:type="dxa" w:w="5544"/>
+          </w:tcPr>
+          <w:p>
+            <w:pPr>
+              <w:spacing w:after="20"/>
+            </w:pPr>
+            <w:r>
+              <w:rPr>
+                <w:color w:val="1C3A36"/>
+                <w:sz w:val="15"/>
+              </w:rPr>
+              <w:t>FY25 standalone sales EGP 4.7bn vs 7.69bn FY24 (Arab Finance AR) — the consolidated subsidiaries carry most of group revenue</w:t>
+            </w:r>
+          </w:p>
+        </w:tc>
+      </w:tr>
+      <w:tr>
+        <w:tc>
+          <w:tcPr>
+            <w:tcW w:type="dxa" w:w="1800"/>
+          </w:tcPr>
+          <w:p>
+            <w:pPr>
+              <w:spacing w:after="20"/>
+            </w:pPr>
+            <w:r>
+              <w:rPr>
+                <w:color w:val="1C3A36"/>
+                <w:sz w:val="15"/>
+              </w:rPr>
+              <w:t>agm_no_dividend</w:t>
+            </w:r>
+          </w:p>
+        </w:tc>
+        <w:tc>
+          <w:tcPr>
+            <w:tcW w:type="dxa" w:w="1656"/>
+          </w:tcPr>
+          <w:p>
+            <w:pPr>
+              <w:spacing w:after="20"/>
+            </w:pPr>
+            <w:r>
+              <w:rPr>
+                <w:color w:val="1C3A36"/>
+                <w:sz w:val="15"/>
+              </w:rPr>
+              <w:t>FY25 profits carried forward, no cash distribution; new boar</w:t>
+            </w:r>
+          </w:p>
+        </w:tc>
+        <w:tc>
+          <w:tcPr>
+            <w:tcW w:type="dxa" w:w="1224"/>
+          </w:tcPr>
+          <w:p>
+            <w:pPr>
+              <w:spacing w:after="20"/>
+            </w:pPr>
+            <w:r>
+              <w:rPr>
+                <w:color w:val="1C3A36"/>
+                <w:sz w:val="15"/>
+              </w:rPr>
+              <w:t>2026-05-06</w:t>
+            </w:r>
+          </w:p>
+        </w:tc>
+        <w:tc>
+          <w:tcPr>
+            <w:tcW w:type="dxa" w:w="5544"/>
+          </w:tcPr>
+          <w:p>
+            <w:pPr>
+              <w:spacing w:after="20"/>
+            </w:pPr>
+            <w:r>
+              <w:rPr>
+                <w:color w:val="1C3A36"/>
+                <w:sz w:val="15"/>
+              </w:rPr>
+              <w:t>AGM resolutions (amwalalghad/almasryalyoum, May-2026)</w:t>
             </w:r>
           </w:p>
         </w:tc>
@@ -4557,7 +5117,7 @@
                 <w:color w:val="1C3A36"/>
                 <w:sz w:val="15"/>
               </w:rPr>
-              <w:t>2,100</w:t>
+              <w:t>1,460</w:t>
             </w:r>
           </w:p>
         </w:tc>
@@ -4591,7 +5151,7 @@
                 <w:color w:val="1C3A36"/>
                 <w:sz w:val="15"/>
               </w:rPr>
-              <w:t>House estimate: FY24 non-debt liabilities 2,300 (liab 11,300 - debt 9,000), scaled to the smaller FY25 revenue base</w:t>
+              <w:t>Rebalanced on the disclosed FY25 debt: liabilities (16,460 assets - 4,100 equity) = 12,360; less debt 10,900 =&gt; non-debt liabilities 1,460. Thin payables are consistent with LC/bank-financed copper imports</w:t>
             </w:r>
           </w:p>
         </w:tc>
@@ -4627,7 +5187,7 @@
                 <w:color w:val="1C3A36"/>
                 <w:sz w:val="15"/>
               </w:rPr>
-              <w:t>12,000</w:t>
+              <w:t>12,640</w:t>
             </w:r>
           </w:p>
         </w:tc>
@@ -4661,7 +5221,7 @@
                 <w:color w:val="1C3A36"/>
                 <w:sz w:val="15"/>
               </w:rPr>
-              <w:t>House derivation: FY25 assets 16,460 - cash ~700 - PP&amp;E ~680 - other ~980 = gross WC ~14,100; less payables ~2,100 =&gt; ~12,000 (111% of FY25 revenue). Consistent with FY24: assets 14,970, NWC ~10,500 (76% of revenue)</w:t>
+              <w:t>House derivation on the disclosed debt: FY25 assets 16,460 - cash ~700 - PP&amp;E ~680 - other ~980 = gross WC ~14,100; less non-debt liabilities ~1,460 =&gt; ~12,640 (117% of FY25 revenue; FY24 was ~76%)</w:t>
             </w:r>
           </w:p>
         </w:tc>
@@ -4697,7 +5257,7 @@
                 <w:color w:val="1C3A36"/>
                 <w:sz w:val="15"/>
               </w:rPr>
-              <w:t>8,800</w:t>
+              <w:t>10,200</w:t>
             </w:r>
           </w:p>
         </w:tc>
@@ -4731,7 +5291,7 @@
                 <w:color w:val="1C3A36"/>
                 <w:sz w:val="15"/>
               </w:rPr>
-              <w:t>House derivation: FY25 liabilities (16,460-4,100 equity) = 12,360; less payables/other ~2,860 =&gt; debt ~9,500; less cash ~700. FY24-vintage sourced anchor: 9,000 - 827.6 = 8,172 (SWS). Sensitized +/-1,000 in the grid</w:t>
+              <w:t>Disclosed FY25 bank facilities 10,900 less estimated cash ~700. The prior derivation (~8,800) understated debt by ~1.4bn; the FY24-vintage sourced alternative (9,000 - 827.6 = 8,172) is shown in sensitivity — the ND anchor is worth ~±EGP 0.6/share and is the single largest input risk</w:t>
             </w:r>
           </w:p>
         </w:tc>
@@ -4907,7 +5467,7 @@
                 <w:color w:val="1C3A36"/>
                 <w:sz w:val="15"/>
               </w:rPr>
-              <w:t>0.13, 0.16, 0.175, 0.185, 0.19</w:t>
+              <w:t>0.075, 0.14, 0.16, 0.175, 0.18</w:t>
             </w:r>
           </w:p>
         </w:tc>
@@ -4941,7 +5501,7 @@
                 <w:color w:val="1C3A36"/>
                 <w:sz w:val="15"/>
               </w:rPr>
-              <w:t>House: Q1-26 implied trough ~14% (loss of 241.6 after ~540 finance cost); FY24-25 prints ~25% carried devaluation-era inventory gains (Ring-4 finding: windfall, not run-rate); mid-cycle set between trough and windfall, sensitized +/-3pp</w:t>
+              <w:t>House, re-anchored on the DISCLOSED Q1-26 lines: gross margin 5.7% and operating profit ~zero (vs 33.1%/30.2% in Q1-25) =&gt; FY26E full-year ~7.5% assumes H2 recovers to ~11-12% as tenders reprice and rates ease; mid-cycle 16-18% sits between the proven trough and the windfall-era ~25% prints; sensitized +/-3pp</w:t>
             </w:r>
           </w:p>
         </w:tc>
@@ -5047,7 +5607,7 @@
                 <w:color w:val="1C3A36"/>
                 <w:sz w:val="15"/>
               </w:rPr>
-              <w:t>1.08, 1.03, 0.98, 0.93, 0.88</w:t>
+              <w:t>1.12, 1.06, 1, 0.94, 0.88</w:t>
             </w:r>
           </w:p>
         </w:tc>
@@ -5081,7 +5641,7 @@
                 <w:color w:val="1C3A36"/>
                 <w:sz w:val="15"/>
               </w:rPr>
-              <w:t>House: FY25 intensity ~111% of revenue (derived above) gliding to 88% as receivables collect and copper-inflated inventory normalises; FY24 was 76% — full reversion NOT assumed; sensitized in the grid</w:t>
+              <w:t>House: FY25 intensity ~117% of revenue (derived on disclosed debt) gliding to 88% as receivables collect and copper-inflated inventory normalises; FY24 was ~76% — full reversion NOT assumed; sensitized in the grid</w:t>
             </w:r>
           </w:p>
         </w:tc>
@@ -5187,7 +5747,7 @@
                 <w:color w:val="1C3A36"/>
                 <w:sz w:val="15"/>
               </w:rPr>
-              <w:t>0.235</w:t>
+              <w:t>0.22</w:t>
             </w:r>
           </w:p>
         </w:tc>
@@ -5221,7 +5781,7 @@
                 <w:color w:val="1C3A36"/>
                 <w:sz w:val="15"/>
               </w:rPr>
-              <w:t>Marginal EGP rate for a levered EGX mid-cap: CBE corridor 19.5-20.0% (held 09-Jul-26) + ~3.5pp levered-credit margin; consistent with avg bank lending 21.3% (Jan-26) plus a leverage premium. Cross-checked against the two effective-rate computations below</w:t>
+              <w:t>Marginal EGP rate for a levered EGX mid-cap: CBE corridor 19.5-20.0% (held 09-Jul-26) + ~2.5pp credit margin; consistent with avg bank lending 21.3% (Jan-26). Cross-checked against the two effective-rate computations below (23.5% FY24, 21.7% FY25 on the disclosed debt path). NB the Q1-26 P&amp;L implies a much smaller net finance line (~243/qtr) than Q1-25 (~542/qtr) — unexplained without the statements (possible FX/interest income offset or capitalised financing); flagged, does not change the marginal rate</w:t>
             </w:r>
           </w:p>
         </w:tc>
@@ -5257,7 +5817,7 @@
                 <w:color w:val="1C3A36"/>
                 <w:sz w:val="15"/>
               </w:rPr>
-              <w:t>0.234</w:t>
+              <w:t>0.235</w:t>
             </w:r>
           </w:p>
         </w:tc>
@@ -5291,7 +5851,7 @@
                 <w:color w:val="1C3A36"/>
                 <w:sz w:val="15"/>
               </w:rPr>
-              <w:t>Effective-rate check #1: FY24 interest ~1,700 (EBIT 3,400 / coverage 2.0x, SWS) / avg debt ~(5,500e+9,000)/2 = 7,250 =&gt; 23.4%</w:t>
+              <w:t>Effective-rate check #1: FY24 interest ~1,700 (EBIT 3,400 / coverage 2.0x, SWS) / avg debt ~(5,500e+8,960)/2 = 7,230 =&gt; 23.5%</w:t>
             </w:r>
           </w:p>
         </w:tc>
@@ -5327,7 +5887,7 @@
                 <w:color w:val="1C3A36"/>
                 <w:sz w:val="15"/>
               </w:rPr>
-              <w:t>0.232</w:t>
+              <w:t>0.217</w:t>
             </w:r>
           </w:p>
         </w:tc>
@@ -5361,7 +5921,7 @@
                 <w:color w:val="1C3A36"/>
                 <w:sz w:val="15"/>
               </w:rPr>
-              <w:t>Effective-rate check #2: FY25 finance cost ~2,150 (derived, closes P&amp;L to reported NP) / avg debt ~9,250 =&gt; 23.2%</w:t>
+              <w:t>Effective-rate check #2: FY25 finance cost ~2,150 (derived, closes P&amp;L to reported NP; independently corroborated by Q1-25's implied ~542/qtr) / avg disclosed debt (8,960+10,900)/2 = 9,930 =&gt; 21.7%</w:t>
             </w:r>
           </w:p>
         </w:tc>
@@ -5607,7 +6167,7 @@
                 <w:color w:val="1C3A36"/>
                 <w:sz w:val="15"/>
               </w:rPr>
-              <w:t>0.235, 0.21, 0.19, 0.17, 0.155</w:t>
+              <w:t>0.22, 0.2, 0.185, 0.168, 0.155</w:t>
             </w:r>
           </w:p>
         </w:tc>

</xml_diff>

<commit_message>
ELEC study rev 3: full bottom-up tonnage build (vol x LME x EGP x k; conversion EBITDA/t); normalized terminal capital structure; limited-liability floor disclosed
Co-Authored-By: Claude Fable 5 <noreply@anthropic.com>
Claude-Session: https://claude.ai/code/session_01WDB3U7m8U6NX4ju3RCn348
</commit_message>
<xml_diff>
--- a/engine/elec_study/ELEC_Source_Register_05-08-2026.docx
+++ b/engine/elec_study/ELEC_Source_Register_05-08-2026.docx
@@ -317,7 +317,7 @@
                 <w:color w:val="1C3A36"/>
                 <w:sz w:val="18"/>
               </w:rPr>
-              <w:t>—</w:t>
+              <w:t>2 records</w:t>
             </w:r>
           </w:p>
         </w:tc>
@@ -370,7 +370,7 @@
                 <w:color w:val="1C3A36"/>
                 <w:sz w:val="18"/>
               </w:rPr>
-              <w:t>7 records</w:t>
+              <w:t>8 records</w:t>
             </w:r>
           </w:p>
         </w:tc>
@@ -476,7 +476,7 @@
                 <w:color w:val="1C3A36"/>
                 <w:sz w:val="18"/>
               </w:rPr>
-              <w:t>30 records</w:t>
+              <w:t>31 records</w:t>
             </w:r>
           </w:p>
         </w:tc>
@@ -529,7 +529,7 @@
                 <w:color w:val="1C3A36"/>
                 <w:sz w:val="18"/>
               </w:rPr>
-              <w:t>25 records</w:t>
+              <w:t>28 records</w:t>
             </w:r>
           </w:p>
         </w:tc>
@@ -1879,7 +1879,7 @@
           <w:color w:val="1C3A36"/>
           <w:sz w:val="22"/>
         </w:rPr>
-        <w:t>C.2  Ring: Country  (7 records)</w:t>
+        <w:t>C.2  Ring: Country  (8 records)</w:t>
       </w:r>
     </w:p>
     <w:tbl>
@@ -2134,6 +2134,76 @@
                 <w:color w:val="1C3A36"/>
                 <w:sz w:val="15"/>
               </w:rPr>
+              <w:t>egp_hist</w:t>
+            </w:r>
+          </w:p>
+        </w:tc>
+        <w:tc>
+          <w:tcPr>
+            <w:tcW w:type="dxa" w:w="1656"/>
+          </w:tcPr>
+          <w:p>
+            <w:pPr>
+              <w:spacing w:after="20"/>
+            </w:pPr>
+            <w:r>
+              <w:rPr>
+                <w:color w:val="1C3A36"/>
+                <w:sz w:val="15"/>
+              </w:rPr>
+              <w:t>FY23=30.7, FY24=45.3, FY25=49.5</w:t>
+            </w:r>
+          </w:p>
+        </w:tc>
+        <w:tc>
+          <w:tcPr>
+            <w:tcW w:type="dxa" w:w="1224"/>
+          </w:tcPr>
+          <w:p>
+            <w:pPr>
+              <w:spacing w:after="20"/>
+            </w:pPr>
+            <w:r>
+              <w:rPr>
+                <w:color w:val="1C3A36"/>
+                <w:sz w:val="15"/>
+              </w:rPr>
+              <w:t>2026-08-05</w:t>
+            </w:r>
+          </w:p>
+        </w:tc>
+        <w:tc>
+          <w:tcPr>
+            <w:tcW w:type="dxa" w:w="5544"/>
+          </w:tcPr>
+          <w:p>
+            <w:pPr>
+              <w:spacing w:after="20"/>
+            </w:pPr>
+            <w:r>
+              <w:rPr>
+                <w:color w:val="1C3A36"/>
+                <w:sz w:val="15"/>
+              </w:rPr>
+              <w:t>USD/EGP annual averages: 2023 official ~30.7 (parallel ~38 — the FY23 implied-volume range below carries both); 2024 blended ~45.3 (float 06-Mar-24); 2025 ~49.5 (range-bound 47-52, +6% appreciation year)</w:t>
+            </w:r>
+          </w:p>
+        </w:tc>
+      </w:tr>
+      <w:tr>
+        <w:tc>
+          <w:tcPr>
+            <w:tcW w:type="dxa" w:w="1800"/>
+          </w:tcPr>
+          <w:p>
+            <w:pPr>
+              <w:spacing w:after="20"/>
+            </w:pPr>
+            <w:r>
+              <w:rPr>
+                <w:color w:val="1C3A36"/>
+                <w:sz w:val="15"/>
+              </w:rPr>
               <w:t>rf</w:t>
             </w:r>
           </w:p>
@@ -2487,7 +2557,7 @@
           <w:color w:val="1C3A36"/>
           <w:sz w:val="22"/>
         </w:rPr>
-        <w:t>C.4  Ring: Company  (30 records)</w:t>
+        <w:t>C.4  Ring: Company  (31 records)</w:t>
       </w:r>
     </w:p>
     <w:tbl>
@@ -4632,6 +4702,76 @@
                 <w:color w:val="1C3A36"/>
                 <w:sz w:val="15"/>
               </w:rPr>
+              <w:t>capacity_kt</w:t>
+            </w:r>
+          </w:p>
+        </w:tc>
+        <w:tc>
+          <w:tcPr>
+            <w:tcW w:type="dxa" w:w="1656"/>
+          </w:tcPr>
+          <w:p>
+            <w:pPr>
+              <w:spacing w:after="20"/>
+            </w:pPr>
+            <w:r>
+              <w:rPr>
+                <w:color w:val="1C3A36"/>
+                <w:sz w:val="15"/>
+              </w:rPr>
+              <w:t>25</w:t>
+            </w:r>
+          </w:p>
+        </w:tc>
+        <w:tc>
+          <w:tcPr>
+            <w:tcW w:type="dxa" w:w="1224"/>
+          </w:tcPr>
+          <w:p>
+            <w:pPr>
+              <w:spacing w:after="20"/>
+            </w:pPr>
+            <w:r>
+              <w:rPr>
+                <w:color w:val="1C3A36"/>
+                <w:sz w:val="15"/>
+              </w:rPr>
+              <w:t>2025</w:t>
+            </w:r>
+          </w:p>
+        </w:tc>
+        <w:tc>
+          <w:tcPr>
+            <w:tcW w:type="dxa" w:w="5544"/>
+          </w:tcPr>
+          <w:p>
+            <w:pPr>
+              <w:spacing w:after="20"/>
+            </w:pPr>
+            <w:r>
+              <w:rPr>
+                <w:color w:val="1C3A36"/>
+                <w:sz w:val="15"/>
+              </w:rPr>
+              <w:t>Annual production capacity ~25,000 t/yr — company profile via IATF exhibitor page; SINGLE-SOURCED and possibly parent-only (consolidated subsidiaries may add capacity), so utilization ratios are indicative, flagged</w:t>
+            </w:r>
+          </w:p>
+        </w:tc>
+      </w:tr>
+      <w:tr>
+        <w:tc>
+          <w:tcPr>
+            <w:tcW w:type="dxa" w:w="1800"/>
+          </w:tcPr>
+          <w:p>
+            <w:pPr>
+              <w:spacing w:after="20"/>
+            </w:pPr>
+            <w:r>
+              <w:rPr>
+                <w:color w:val="1C3A36"/>
+                <w:sz w:val="15"/>
+              </w:rPr>
               <w:t>debt_ccy_evidence</w:t>
             </w:r>
           </w:p>
@@ -4705,7 +4845,7 @@
           <w:color w:val="1C3A36"/>
           <w:sz w:val="22"/>
         </w:rPr>
-        <w:t>C.5  Ring: House  (25 records)</w:t>
+        <w:t>C.5  Ring: House  (28 records)</w:t>
       </w:r>
     </w:p>
     <w:tbl>
@@ -5380,7 +5520,7 @@
                 <w:color w:val="1C3A36"/>
                 <w:sz w:val="15"/>
               </w:rPr>
-              <w:t>rev_growth</w:t>
+              <w:t>egp_fcst</w:t>
             </w:r>
           </w:p>
         </w:tc>
@@ -5397,7 +5537,7 @@
                 <w:color w:val="1C3A36"/>
                 <w:sz w:val="15"/>
               </w:rPr>
-              <w:t>-0.196, 0.14, 0.12, 0.1, 0.08</w:t>
+              <w:t>50.4, 52, 53.5, 55, 56.5</w:t>
             </w:r>
           </w:p>
         </w:tc>
@@ -5431,7 +5571,7 @@
                 <w:color w:val="1C3A36"/>
                 <w:sz w:val="15"/>
               </w:rPr>
-              <w:t>House: FY26E anchored on Q1-26 -43.8% with H2 stabilisation as CBE resumes easing; recovery years on the EETC EGP45bn grid plan, EU 690mn package, Saudi interconnector completion and 6.7% CAGR industry path (6Wresearch)</w:t>
+              <w:t>~3%/yr nominal crawl — the inflation differential narrows as the CBE targets bite; far below PPP catch-up, consistent with the post-float managed range</w:t>
             </w:r>
           </w:p>
         </w:tc>
@@ -5450,7 +5590,7 @@
                 <w:color w:val="1C3A36"/>
                 <w:sz w:val="15"/>
               </w:rPr>
-              <w:t>ebitda_margin</w:t>
+              <w:t>k_uplift</w:t>
             </w:r>
           </w:p>
         </w:tc>
@@ -5467,7 +5607,7 @@
                 <w:color w:val="1C3A36"/>
                 <w:sz w:val="15"/>
               </w:rPr>
-              <w:t>0.075, 0.14, 0.16, 0.175, 0.18</w:t>
+              <w:t>1.387</w:t>
             </w:r>
           </w:p>
         </w:tc>
@@ -5501,7 +5641,7 @@
                 <w:color w:val="1C3A36"/>
                 <w:sz w:val="15"/>
               </w:rPr>
-              <w:t>House, re-anchored on the DISCLOSED Q1-26 lines: gross margin 5.7% and operating profit ~zero (vs 33.1%/30.2% in Q1-25) =&gt; FY26E full-year ~7.5% assumes H2 recovers to ~11-12% as tenders reprice and rates ease; mid-cycle 16-18% sits between the proven trough and the windfall-era ~25% prints; sensitized +/-3pp</w:t>
+              <w:t>Fabrication uplift: cable price per tonne / copper cost per tonne. Set from the industry norm that copper is ~70-75% of a power-cable price (IndexBox: LME 'directly and rapidly reflected' in quotations) =&gt; k = 1/0.72 = 1.39. VALIDATION, not calibration: FY24 revenue 13,778 at 9,147 x 45.3 x 1.387 = 574k EGP/t implies 24.0 kt — 96% of the stated 25 kt capacity in the sector's boom year. Sensitized ±5%</w:t>
             </w:r>
           </w:p>
         </w:tc>
@@ -5520,7 +5660,7 @@
                 <w:color w:val="1C3A36"/>
                 <w:sz w:val="15"/>
               </w:rPr>
-              <w:t>capex_pct</w:t>
+              <w:t>vols_fcst</w:t>
             </w:r>
           </w:p>
         </w:tc>
@@ -5537,7 +5677,7 @@
                 <w:color w:val="1C3A36"/>
                 <w:sz w:val="15"/>
               </w:rPr>
-              <w:t>0.016</w:t>
+              <w:t>10.4, 11.9, 13.4, 14.8, 16</w:t>
             </w:r>
           </w:p>
         </w:tc>
@@ -5571,7 +5711,7 @@
                 <w:color w:val="1C3A36"/>
                 <w:sz w:val="15"/>
               </w:rPr>
-              <w:t>House: maintenance-level for a working-capital-intensive assembler; no disclosed capex found any year (flagged gap); FY24 D&amp;A ~0.7% of revenue corroborates a light fixed-asset base</w:t>
+              <w:t>Volumes (kt): Q1-26 implied ~2.4 kt/qtr sets the FY26E base (~42% utilization); recovery on EETC's EGP 45bn plan, the EU package and interconnector follow-on to ~64% utilization by FY30E — still below the FY23-24 near-full prints; sensitized ±15%</w:t>
             </w:r>
           </w:p>
         </w:tc>
@@ -5590,7 +5730,7 @@
                 <w:color w:val="1C3A36"/>
                 <w:sz w:val="15"/>
               </w:rPr>
-              <w:t>nwc_pct</w:t>
+              <w:t>ebitda_per_t</w:t>
             </w:r>
           </w:p>
         </w:tc>
@@ -5607,7 +5747,7 @@
                 <w:color w:val="1C3A36"/>
                 <w:sz w:val="15"/>
               </w:rPr>
-              <w:t>1.12, 1.06, 1, 0.94, 0.88</w:t>
+              <w:t>40, 90, 115, 128, 135</w:t>
             </w:r>
           </w:p>
         </w:tc>
@@ -5641,7 +5781,7 @@
                 <w:color w:val="1C3A36"/>
                 <w:sz w:val="15"/>
               </w:rPr>
-              <w:t>House: FY25 intensity ~117% of revenue (derived on disclosed debt) gliding to 88% as receivables collect and copper-inflated inventory normalises; FY24 was ~76% — full reversion NOT assumed; sensitized in the grid</w:t>
+              <w:t>Conversion EBITDA per tonne (k EGP/t). Historical: FY23 ~111k, FY24 ~145k (both near-full utilization WITH devaluation inventory gains), FY25 ~183k (copper-gain inflated), Q1-26 ~11k (under-absorption at ~40% utilization). Forecast recovers with utilization to 135k by FY30E — BELOW FY24's 145k nominal despite five years of EGP inflation, i.e. a ~30% real discount to the windfall; sensitized ±30%. CROSS-CHECK: as a share of realized price/t, the terminal 135/987 = 13.7% matches the PRE-windfall 2022 norm (~12% of price at 24.4kt implied full utilization) — the forecast returns the company to its pre-devaluation conversion economics, not to the windfall</w:t>
             </w:r>
           </w:p>
         </w:tc>
@@ -5660,7 +5800,7 @@
                 <w:color w:val="1C3A36"/>
                 <w:sz w:val="15"/>
               </w:rPr>
-              <w:t>beta</w:t>
+              <w:t>capex_mn</w:t>
             </w:r>
           </w:p>
         </w:tc>
@@ -5677,7 +5817,7 @@
                 <w:color w:val="1C3A36"/>
                 <w:sz w:val="15"/>
               </w:rPr>
-              <w:t>0.964</w:t>
+              <w:t>225, 243, 262, 283, 306</w:t>
             </w:r>
           </w:p>
         </w:tc>
@@ -5711,7 +5851,7 @@
                 <w:color w:val="1C3A36"/>
                 <w:sz w:val="15"/>
               </w:rPr>
-              <w:t>Own-stock tier-1 regression: ELEC weekly log-returns vs 30-name equal-weight EGX composite (full engine library), 5yr window: beta 0.964, R2 0.222, n=257, SE 0.113, CI90 [0.78, 1.15] — passes usability gate; NOT weak-flagged (R2&gt;10%, CI span &lt; 2x beta)</w:t>
+              <w:t>Maintenance capex ~EGP 9k per tonne of capacity (25 kt), escalated ~8%/yr — no disclosed capex any year (flagged gap); FY24 D&amp;A ~0.7% of revenue corroborates a light fixed-asset base</w:t>
             </w:r>
           </w:p>
         </w:tc>
@@ -5730,7 +5870,7 @@
                 <w:color w:val="1C3A36"/>
                 <w:sz w:val="15"/>
               </w:rPr>
-              <w:t>kd</w:t>
+              <w:t>nwc_pct</w:t>
             </w:r>
           </w:p>
         </w:tc>
@@ -5747,7 +5887,7 @@
                 <w:color w:val="1C3A36"/>
                 <w:sz w:val="15"/>
               </w:rPr>
-              <w:t>0.22</w:t>
+              <w:t>1.12, 1.06, 1, 0.94, 0.88</w:t>
             </w:r>
           </w:p>
         </w:tc>
@@ -5781,7 +5921,7 @@
                 <w:color w:val="1C3A36"/>
                 <w:sz w:val="15"/>
               </w:rPr>
-              <w:t>Marginal EGP rate for a levered EGX mid-cap: CBE corridor 19.5-20.0% (held 09-Jul-26) + ~2.5pp credit margin; consistent with avg bank lending 21.3% (Jan-26). Cross-checked against the two effective-rate computations below (23.5% FY24, 21.7% FY25 on the disclosed debt path). NB the Q1-26 P&amp;L implies a much smaller net finance line (~243/qtr) than Q1-25 (~542/qtr) — unexplained without the statements (possible FX/interest income offset or capitalised financing); flagged, does not change the marginal rate</w:t>
+              <w:t>House: FY25 intensity ~117% of revenue (derived on disclosed debt) gliding to 88% as receivables collect and copper-inflated inventory normalises; FY24 was ~76% — full reversion NOT assumed; sensitized in the grid</w:t>
             </w:r>
           </w:p>
         </w:tc>
@@ -5800,7 +5940,7 @@
                 <w:color w:val="1C3A36"/>
                 <w:sz w:val="15"/>
               </w:rPr>
-              <w:t>kd_eff_fy24</w:t>
+              <w:t>beta</w:t>
             </w:r>
           </w:p>
         </w:tc>
@@ -5817,7 +5957,7 @@
                 <w:color w:val="1C3A36"/>
                 <w:sz w:val="15"/>
               </w:rPr>
-              <w:t>0.235</w:t>
+              <w:t>0.964</w:t>
             </w:r>
           </w:p>
         </w:tc>
@@ -5851,7 +5991,7 @@
                 <w:color w:val="1C3A36"/>
                 <w:sz w:val="15"/>
               </w:rPr>
-              <w:t>Effective-rate check #1: FY24 interest ~1,700 (EBIT 3,400 / coverage 2.0x, SWS) / avg debt ~(5,500e+8,960)/2 = 7,230 =&gt; 23.5%</w:t>
+              <w:t>Own-stock tier-1 regression: ELEC weekly log-returns vs 30-name equal-weight EGX composite (full engine library), 5yr window: beta 0.964, R2 0.222, n=257, SE 0.113, CI90 [0.78, 1.15] — passes usability gate; NOT weak-flagged (R2&gt;10%, CI span &lt; 2x beta)</w:t>
             </w:r>
           </w:p>
         </w:tc>
@@ -5870,7 +6010,7 @@
                 <w:color w:val="1C3A36"/>
                 <w:sz w:val="15"/>
               </w:rPr>
-              <w:t>kd_eff_fy25</w:t>
+              <w:t>kd</w:t>
             </w:r>
           </w:p>
         </w:tc>
@@ -5887,7 +6027,7 @@
                 <w:color w:val="1C3A36"/>
                 <w:sz w:val="15"/>
               </w:rPr>
-              <w:t>0.217</w:t>
+              <w:t>0.22</w:t>
             </w:r>
           </w:p>
         </w:tc>
@@ -5921,7 +6061,7 @@
                 <w:color w:val="1C3A36"/>
                 <w:sz w:val="15"/>
               </w:rPr>
-              <w:t>Effective-rate check #2: FY25 finance cost ~2,150 (derived, closes P&amp;L to reported NP; independently corroborated by Q1-25's implied ~542/qtr) / avg disclosed debt (8,960+10,900)/2 = 9,930 =&gt; 21.7%</w:t>
+              <w:t>Marginal EGP rate for a levered EGX mid-cap: CBE corridor 19.5-20.0% (held 09-Jul-26) + ~2.5pp credit margin; consistent with avg bank lending 21.3% (Jan-26). Cross-checked against the two effective-rate computations below (23.5% FY24, 21.7% FY25 on the disclosed debt path). NB the Q1-26 P&amp;L implies a much smaller net finance line (~243/qtr) than Q1-25 (~542/qtr) — unexplained without the statements (possible FX/interest income offset or capitalised financing); flagged, does not change the marginal rate</w:t>
             </w:r>
           </w:p>
         </w:tc>
@@ -5940,6 +6080,146 @@
                 <w:color w:val="1C3A36"/>
                 <w:sz w:val="15"/>
               </w:rPr>
+              <w:t>kd_eff_fy24</w:t>
+            </w:r>
+          </w:p>
+        </w:tc>
+        <w:tc>
+          <w:tcPr>
+            <w:tcW w:type="dxa" w:w="1656"/>
+          </w:tcPr>
+          <w:p>
+            <w:pPr>
+              <w:spacing w:after="20"/>
+            </w:pPr>
+            <w:r>
+              <w:rPr>
+                <w:color w:val="1C3A36"/>
+                <w:sz w:val="15"/>
+              </w:rPr>
+              <w:t>0.235</w:t>
+            </w:r>
+          </w:p>
+        </w:tc>
+        <w:tc>
+          <w:tcPr>
+            <w:tcW w:type="dxa" w:w="1224"/>
+          </w:tcPr>
+          <w:p>
+            <w:pPr>
+              <w:spacing w:after="20"/>
+            </w:pPr>
+            <w:r>
+              <w:rPr>
+                <w:color w:val="1C3A36"/>
+                <w:sz w:val="15"/>
+              </w:rPr>
+              <w:t>2026-08-05</w:t>
+            </w:r>
+          </w:p>
+        </w:tc>
+        <w:tc>
+          <w:tcPr>
+            <w:tcW w:type="dxa" w:w="5544"/>
+          </w:tcPr>
+          <w:p>
+            <w:pPr>
+              <w:spacing w:after="20"/>
+            </w:pPr>
+            <w:r>
+              <w:rPr>
+                <w:color w:val="1C3A36"/>
+                <w:sz w:val="15"/>
+              </w:rPr>
+              <w:t>Effective-rate check #1: FY24 interest ~1,700 (EBIT 3,400 / coverage 2.0x, SWS) / avg debt ~(5,500e+8,960)/2 = 7,230 =&gt; 23.5%</w:t>
+            </w:r>
+          </w:p>
+        </w:tc>
+      </w:tr>
+      <w:tr>
+        <w:tc>
+          <w:tcPr>
+            <w:tcW w:type="dxa" w:w="1800"/>
+          </w:tcPr>
+          <w:p>
+            <w:pPr>
+              <w:spacing w:after="20"/>
+            </w:pPr>
+            <w:r>
+              <w:rPr>
+                <w:color w:val="1C3A36"/>
+                <w:sz w:val="15"/>
+              </w:rPr>
+              <w:t>kd_eff_fy25</w:t>
+            </w:r>
+          </w:p>
+        </w:tc>
+        <w:tc>
+          <w:tcPr>
+            <w:tcW w:type="dxa" w:w="1656"/>
+          </w:tcPr>
+          <w:p>
+            <w:pPr>
+              <w:spacing w:after="20"/>
+            </w:pPr>
+            <w:r>
+              <w:rPr>
+                <w:color w:val="1C3A36"/>
+                <w:sz w:val="15"/>
+              </w:rPr>
+              <w:t>0.217</w:t>
+            </w:r>
+          </w:p>
+        </w:tc>
+        <w:tc>
+          <w:tcPr>
+            <w:tcW w:type="dxa" w:w="1224"/>
+          </w:tcPr>
+          <w:p>
+            <w:pPr>
+              <w:spacing w:after="20"/>
+            </w:pPr>
+            <w:r>
+              <w:rPr>
+                <w:color w:val="1C3A36"/>
+                <w:sz w:val="15"/>
+              </w:rPr>
+              <w:t>2026-08-05</w:t>
+            </w:r>
+          </w:p>
+        </w:tc>
+        <w:tc>
+          <w:tcPr>
+            <w:tcW w:type="dxa" w:w="5544"/>
+          </w:tcPr>
+          <w:p>
+            <w:pPr>
+              <w:spacing w:after="20"/>
+            </w:pPr>
+            <w:r>
+              <w:rPr>
+                <w:color w:val="1C3A36"/>
+                <w:sz w:val="15"/>
+              </w:rPr>
+              <w:t>Effective-rate check #2: FY25 finance cost ~2,150 (derived, closes P&amp;L to reported NP; independently corroborated by Q1-25's implied ~542/qtr) / avg disclosed debt (8,960+10,900)/2 = 9,930 =&gt; 21.7%</w:t>
+            </w:r>
+          </w:p>
+        </w:tc>
+      </w:tr>
+      <w:tr>
+        <w:tc>
+          <w:tcPr>
+            <w:tcW w:type="dxa" w:w="1800"/>
+          </w:tcPr>
+          <w:p>
+            <w:pPr>
+              <w:spacing w:after="20"/>
+            </w:pPr>
+            <w:r>
+              <w:rPr>
+                <w:color w:val="1C3A36"/>
+                <w:sz w:val="15"/>
+              </w:rPr>
               <w:t>kd_term</w:t>
             </w:r>
           </w:p>
@@ -5992,6 +6272,76 @@
                 <w:sz w:val="15"/>
               </w:rPr>
               <w:t>Terminal Kd: Egyptian long-run corporate-borrowing norm 14-16%, midpoint (standing house norm; no name-specific reason to deviate)</w:t>
+            </w:r>
+          </w:p>
+        </w:tc>
+      </w:tr>
+      <w:tr>
+        <w:tc>
+          <w:tcPr>
+            <w:tcW w:type="dxa" w:w="1800"/>
+          </w:tcPr>
+          <w:p>
+            <w:pPr>
+              <w:spacing w:after="20"/>
+            </w:pPr>
+            <w:r>
+              <w:rPr>
+                <w:color w:val="1C3A36"/>
+                <w:sz w:val="15"/>
+              </w:rPr>
+              <w:t>wd_term</w:t>
+            </w:r>
+          </w:p>
+        </w:tc>
+        <w:tc>
+          <w:tcPr>
+            <w:tcW w:type="dxa" w:w="1656"/>
+          </w:tcPr>
+          <w:p>
+            <w:pPr>
+              <w:spacing w:after="20"/>
+            </w:pPr>
+            <w:r>
+              <w:rPr>
+                <w:color w:val="1C3A36"/>
+                <w:sz w:val="15"/>
+              </w:rPr>
+              <w:t>0.4</w:t>
+            </w:r>
+          </w:p>
+        </w:tc>
+        <w:tc>
+          <w:tcPr>
+            <w:tcW w:type="dxa" w:w="1224"/>
+          </w:tcPr>
+          <w:p>
+            <w:pPr>
+              <w:spacing w:after="20"/>
+            </w:pPr>
+            <w:r>
+              <w:rPr>
+                <w:color w:val="1C3A36"/>
+                <w:sz w:val="15"/>
+              </w:rPr>
+              <w:t>2026-08-05</w:t>
+            </w:r>
+          </w:p>
+        </w:tc>
+        <w:tc>
+          <w:tcPr>
+            <w:tcW w:type="dxa" w:w="5544"/>
+          </w:tcPr>
+          <w:p>
+            <w:pPr>
+              <w:spacing w:after="20"/>
+            </w:pPr>
+            <w:r>
+              <w:rPr>
+                <w:color w:val="1C3A36"/>
+                <w:sz w:val="15"/>
+              </w:rPr>
+              <w:t>Terminal debt weight D/(D+E): NORMALIZED capital structure, not today's ~60% distress weight — the steady state the terminal value describes presupposes deleveraging, and current market-value weights are circular (the equity weight depends on the DCF's own output). 40% is the industry-normal structure for a working-capital-funded cable maker; sensitized via the terminal-WACC grid</w:t>
             </w:r>
           </w:p>
         </w:tc>

</xml_diff>

<commit_message>
ELEC rev 4: net-debt anchor triangulated by FY24->FY25 roll-forward (9,805, was 10,200)
Replace the ambiguous facilities-sentence reading with a three-method
triangulation off the FY24 audited comparatives and the four hard
disclosed FY25 points (assets, NP, revenue, no dividend). Verdict
unchanged: EV still does not cover net debt; central 0.34 (-84%).

Co-Authored-By: Claude Fable 5 <noreply@anthropic.com>
Claude-Session: https://claude.ai/code/session_01WDB3U7m8U6NX4ju3RCn348
</commit_message>
<xml_diff>
--- a/engine/elec_study/ELEC_Source_Register_05-08-2026.docx
+++ b/engine/elec_study/ELEC_Source_Register_05-08-2026.docx
@@ -529,7 +529,7 @@
                 <w:color w:val="1C3A36"/>
                 <w:sz w:val="18"/>
               </w:rPr>
-              <w:t>28 records</w:t>
+              <w:t>30 records</w:t>
             </w:r>
           </w:p>
         </w:tc>
@@ -4142,7 +4142,7 @@
                 <w:color w:val="1C3A36"/>
                 <w:sz w:val="15"/>
               </w:rPr>
-              <w:t>debt_fy25</w:t>
+              <w:t>facilities_fy25</w:t>
             </w:r>
           </w:p>
         </w:tc>
@@ -4193,7 +4193,7 @@
                 <w:color w:val="1C3A36"/>
                 <w:sz w:val="15"/>
               </w:rPr>
-              <w:t>Bank credit facilities held at end-2025: 'obtained credit facilities of EGP 10.9bn during 2025 vs 8.96bn in 2024, from several local banks' (almalnews/amwalalghad FY25 results coverage of the EGX filing). Read as the drawn year-end balance because the 2024 comparative (8.96bn) matches the FY24 balance-sheet debt print (~9.0bn, SWS) almost exactly; interpretation flagged and the FY24-vintage alternative shown in sensitivity</w:t>
+              <w:t>Disclosed: 'obtained credit facilities of EGP 10.9bn during 2025 vs 8.96bn in 2024, from several local banks' (almalnews/amwalalghad FY25 results coverage of the EGX filing). AMBIGUOUS between drawn balance and limits granted — no longer used directly as the debt anchor; retained as the disclosure record and upper cross-check (the triangulated drawn debt below implies ~96% drawn if these are limits)</w:t>
             </w:r>
           </w:p>
         </w:tc>
@@ -4845,7 +4845,7 @@
           <w:color w:val="1C3A36"/>
           <w:sz w:val="22"/>
         </w:rPr>
-        <w:t>C.5  Ring: House  (28 records)</w:t>
+        <w:t>C.5  Ring: House  (30 records)</w:t>
       </w:r>
     </w:p>
     <w:tbl>
@@ -5030,7 +5030,7 @@
                 <w:color w:val="1C3A36"/>
                 <w:sz w:val="15"/>
               </w:rPr>
-              <w:t>fin_cost_fy25_est</w:t>
+              <w:t>debt_fy25</w:t>
             </w:r>
           </w:p>
         </w:tc>
@@ -5047,7 +5047,7 @@
                 <w:color w:val="1C3A36"/>
                 <w:sz w:val="15"/>
               </w:rPr>
-              <w:t>2,150</w:t>
+              <w:t>10,465</w:t>
             </w:r>
           </w:p>
         </w:tc>
@@ -5081,7 +5081,7 @@
                 <w:color w:val="1C3A36"/>
                 <w:sz w:val="15"/>
               </w:rPr>
-              <w:t>House derivation: avg debt ~9.25bn x ~23.2% effective (CBE corridor 2025 path); closes FY25 P&amp;L to the reported NP 500.3 via EBT=NP/(1-22.5%)</w:t>
+              <w:t>TRIANGULATED drawn debt (rollforward_fy25.py): total liabilities 12,360 (disclosed assets 16,460 - rolled equity 4,100) less non-debt liabilities ~1,890 (FY24's 2,410 scaled with purchase value, -21.5%). Independent of the ambiguous facilities sentence; sits at 96% of the disclosed 10.9bn facilities</w:t>
             </w:r>
           </w:p>
         </w:tc>
@@ -5100,7 +5100,7 @@
                 <w:color w:val="1C3A36"/>
                 <w:sz w:val="15"/>
               </w:rPr>
-              <w:t>fin_cost_fy23_est</w:t>
+              <w:t>cash_fy25_est</w:t>
             </w:r>
           </w:p>
         </w:tc>
@@ -5117,7 +5117,7 @@
                 <w:color w:val="1C3A36"/>
                 <w:sz w:val="15"/>
               </w:rPr>
-              <w:t>990</w:t>
+              <w:t>665</w:t>
             </w:r>
           </w:p>
         </w:tc>
@@ -5151,7 +5151,7 @@
                 <w:color w:val="1C3A36"/>
                 <w:sz w:val="15"/>
               </w:rPr>
-              <w:t>House derivation: avg FY23 debt ~4.5bn (D/E path 36%-&gt;248% over 5yrs, SWS) x ~22% 2023 corridor-linked rate</w:t>
+              <w:t>House: midpoint of [500 stress floor, 830 FY24-flat] — a no-dividend, liquidity-conserving year argues below the FY24 print (827.6)</w:t>
             </w:r>
           </w:p>
         </w:tc>
@@ -5170,7 +5170,7 @@
                 <w:color w:val="1C3A36"/>
                 <w:sz w:val="15"/>
               </w:rPr>
-              <w:t>dna_pct</w:t>
+              <w:t>fin_cost_fy25_est</w:t>
             </w:r>
           </w:p>
         </w:tc>
@@ -5187,7 +5187,7 @@
                 <w:color w:val="1C3A36"/>
                 <w:sz w:val="15"/>
               </w:rPr>
-              <w:t>0.013</w:t>
+              <w:t>2,150</w:t>
             </w:r>
           </w:p>
         </w:tc>
@@ -5221,7 +5221,7 @@
                 <w:color w:val="1C3A36"/>
                 <w:sz w:val="15"/>
               </w:rPr>
-              <w:t>House: FY24 EBITDA 3,490 - EBIT 3,400 = ~90mn D&amp;A on 13.8bn revenue (~0.7%); forecast set at 1.3% of revenue to fund modest PP&amp;E renewal</w:t>
+              <w:t>House derivation: avg debt ~9.25bn x ~23.2% effective (CBE corridor 2025 path); closes FY25 P&amp;L to the reported NP 500.3 via EBT=NP/(1-22.5%)</w:t>
             </w:r>
           </w:p>
         </w:tc>
@@ -5240,7 +5240,7 @@
                 <w:color w:val="1C3A36"/>
                 <w:sz w:val="15"/>
               </w:rPr>
-              <w:t>payables_fy25_est</w:t>
+              <w:t>fin_cost_fy23_est</w:t>
             </w:r>
           </w:p>
         </w:tc>
@@ -5257,7 +5257,7 @@
                 <w:color w:val="1C3A36"/>
                 <w:sz w:val="15"/>
               </w:rPr>
-              <w:t>1,460</w:t>
+              <w:t>990</w:t>
             </w:r>
           </w:p>
         </w:tc>
@@ -5291,7 +5291,7 @@
                 <w:color w:val="1C3A36"/>
                 <w:sz w:val="15"/>
               </w:rPr>
-              <w:t>Rebalanced on the disclosed FY25 debt: liabilities (16,460 assets - 4,100 equity) = 12,360; less debt 10,900 =&gt; non-debt liabilities 1,460. Thin payables are consistent with LC/bank-financed copper imports</w:t>
+              <w:t>House derivation: avg FY23 debt ~4.5bn (D/E path 36%-&gt;248% over 5yrs, SWS) x ~22% 2023 corridor-linked rate</w:t>
             </w:r>
           </w:p>
         </w:tc>
@@ -5310,7 +5310,7 @@
                 <w:color w:val="1C3A36"/>
                 <w:sz w:val="15"/>
               </w:rPr>
-              <w:t>nwc_fy25_est</w:t>
+              <w:t>dna_pct</w:t>
             </w:r>
           </w:p>
         </w:tc>
@@ -5327,7 +5327,7 @@
                 <w:color w:val="1C3A36"/>
                 <w:sz w:val="15"/>
               </w:rPr>
-              <w:t>12,640</w:t>
+              <w:t>0.013</w:t>
             </w:r>
           </w:p>
         </w:tc>
@@ -5361,7 +5361,7 @@
                 <w:color w:val="1C3A36"/>
                 <w:sz w:val="15"/>
               </w:rPr>
-              <w:t>House derivation on the disclosed debt: FY25 assets 16,460 - cash ~700 - PP&amp;E ~680 - other ~980 = gross WC ~14,100; less non-debt liabilities ~1,460 =&gt; ~12,640 (117% of FY25 revenue; FY24 was ~76%)</w:t>
+              <w:t>House: FY24 EBITDA 3,490 - EBIT 3,400 = ~90mn D&amp;A on 13.8bn revenue (~0.7%); forecast set at 1.3% of revenue to fund modest PP&amp;E renewal</w:t>
             </w:r>
           </w:p>
         </w:tc>
@@ -5380,7 +5380,7 @@
                 <w:color w:val="1C3A36"/>
                 <w:sz w:val="15"/>
               </w:rPr>
-              <w:t>net_debt_fy25_est</w:t>
+              <w:t>payables_fy25_est</w:t>
             </w:r>
           </w:p>
         </w:tc>
@@ -5397,7 +5397,7 @@
                 <w:color w:val="1C3A36"/>
                 <w:sz w:val="15"/>
               </w:rPr>
-              <w:t>10,200</w:t>
+              <w:t>1,890</w:t>
             </w:r>
           </w:p>
         </w:tc>
@@ -5431,7 +5431,7 @@
                 <w:color w:val="1C3A36"/>
                 <w:sz w:val="15"/>
               </w:rPr>
-              <w:t>Disclosed FY25 bank facilities 10,900 less estimated cash ~700. The prior derivation (~8,800) understated debt by ~1.4bn; the FY24-vintage sourced alternative (9,000 - 827.6 = 8,172) is shown in sensitivity — the ND anchor is worth ~±EGP 0.6/share and is the single largest input risk</w:t>
+              <w:t>Non-debt liabilities rolled from FY24's 2,410 on purchase value (volume -34%, copper-in-EGP +20% =&gt; x0.785); thin payables consistent with LC/bank-financed copper imports (rollforward_fy25.py)</w:t>
             </w:r>
           </w:p>
         </w:tc>
@@ -5450,7 +5450,7 @@
                 <w:color w:val="1C3A36"/>
                 <w:sz w:val="15"/>
               </w:rPr>
-              <w:t>equity_fy25_est</w:t>
+              <w:t>nwc_fy25_est</w:t>
             </w:r>
           </w:p>
         </w:tc>
@@ -5467,7 +5467,7 @@
                 <w:color w:val="1C3A36"/>
                 <w:sz w:val="15"/>
               </w:rPr>
-              <w:t>4,100</w:t>
+              <w:t>12,245</w:t>
             </w:r>
           </w:p>
         </w:tc>
@@ -5501,7 +5501,7 @@
                 <w:color w:val="1C3A36"/>
                 <w:sz w:val="15"/>
               </w:rPr>
-              <w:t>House derivation: FY24 equity 3,600 + FY25 NP 500.3, no dividends (company has never paid one)</w:t>
+              <w:t>House derivation on the triangulated balance sheet: FY25 assets 16,460 - cash 665 - PP&amp;E ~680 - other ~980 = gross WC ~14,135; less non-debt liabilities ~1,890 =&gt; ~12,245 (113% of FY25 revenue; FY24 was ~76%)</w:t>
             </w:r>
           </w:p>
         </w:tc>
@@ -5520,7 +5520,7 @@
                 <w:color w:val="1C3A36"/>
                 <w:sz w:val="15"/>
               </w:rPr>
-              <w:t>egp_fcst</w:t>
+              <w:t>net_debt_fy25_est</w:t>
             </w:r>
           </w:p>
         </w:tc>
@@ -5537,7 +5537,7 @@
                 <w:color w:val="1C3A36"/>
                 <w:sz w:val="15"/>
               </w:rPr>
-              <w:t>50.4, 52, 53.5, 55, 56.5</w:t>
+              <w:t>9,805</w:t>
             </w:r>
           </w:p>
         </w:tc>
@@ -5571,7 +5571,7 @@
                 <w:color w:val="1C3A36"/>
                 <w:sz w:val="15"/>
               </w:rPr>
-              <w:t>~3%/yr nominal crawl — the inflation differential narrows as the CBE targets bite; far below PPP catch-up, consistent with the post-float managed range</w:t>
+              <w:t>TRIANGULATED (rollforward_fy25.py, replacing the facilities-sentence reading 10,200): (A) balance-sheet residual — disclosed assets 16,460 less rolled equity 4,100 (FY24 3,600 + NP 500.3, no dividend) gives liabilities 12,360; less non-debt liabilities ~1,890 =&gt; drawn debt 10,465; less cash 665 =&gt; 9,802. (B) cash-flow roll-forward from FY24 ND 8,132 + interest 2,150 + tax 145 + capex 210 + dNWC ~2,036 - EBITDA 2,871 =&gt; 9,803 (shares the balance-sheet WC decomposition with A — agreement is consistency, not full independence). (C) facilities-as-drawn 10,235 = the upper cross-check. Range 9,120-10,360 carried in sensitivity (~±EGP 0.19/sh); the FY24-vintage low alternative 8,172 is REJECTED by the reverse test (needs non-debt liabilities +41% while purchases fell 21%). Falsifier: audited FY25 borrowings note</w:t>
             </w:r>
           </w:p>
         </w:tc>
@@ -5590,7 +5590,7 @@
                 <w:color w:val="1C3A36"/>
                 <w:sz w:val="15"/>
               </w:rPr>
-              <w:t>k_uplift</w:t>
+              <w:t>equity_fy25_est</w:t>
             </w:r>
           </w:p>
         </w:tc>
@@ -5607,7 +5607,7 @@
                 <w:color w:val="1C3A36"/>
                 <w:sz w:val="15"/>
               </w:rPr>
-              <w:t>1.387</w:t>
+              <w:t>4,100</w:t>
             </w:r>
           </w:p>
         </w:tc>
@@ -5641,7 +5641,7 @@
                 <w:color w:val="1C3A36"/>
                 <w:sz w:val="15"/>
               </w:rPr>
-              <w:t>Fabrication uplift: cable price per tonne / copper cost per tonne. Set from the industry norm that copper is ~70-75% of a power-cable price (IndexBox: LME 'directly and rapidly reflected' in quotations) =&gt; k = 1/0.72 = 1.39. VALIDATION, not calibration: FY24 revenue 13,778 at 9,147 x 45.3 x 1.387 = 574k EGP/t implies 24.0 kt — 96% of the stated 25 kt capacity in the sector's boom year. Sensitized ±5%</w:t>
+              <w:t>House derivation: FY24 equity 3,600 + FY25 NP 500.3, no dividends (company has never paid one)</w:t>
             </w:r>
           </w:p>
         </w:tc>
@@ -5660,7 +5660,7 @@
                 <w:color w:val="1C3A36"/>
                 <w:sz w:val="15"/>
               </w:rPr>
-              <w:t>vols_fcst</w:t>
+              <w:t>egp_fcst</w:t>
             </w:r>
           </w:p>
         </w:tc>
@@ -5677,7 +5677,7 @@
                 <w:color w:val="1C3A36"/>
                 <w:sz w:val="15"/>
               </w:rPr>
-              <w:t>10.4, 11.9, 13.4, 14.8, 16</w:t>
+              <w:t>50.4, 52, 53.5, 55, 56.5</w:t>
             </w:r>
           </w:p>
         </w:tc>
@@ -5711,7 +5711,7 @@
                 <w:color w:val="1C3A36"/>
                 <w:sz w:val="15"/>
               </w:rPr>
-              <w:t>Volumes (kt): Q1-26 implied ~2.4 kt/qtr sets the FY26E base (~42% utilization); recovery on EETC's EGP 45bn plan, the EU package and interconnector follow-on to ~64% utilization by FY30E — still below the FY23-24 near-full prints; sensitized ±15%</w:t>
+              <w:t>~3%/yr nominal crawl — the inflation differential narrows as the CBE targets bite; far below PPP catch-up, consistent with the post-float managed range</w:t>
             </w:r>
           </w:p>
         </w:tc>
@@ -5730,7 +5730,7 @@
                 <w:color w:val="1C3A36"/>
                 <w:sz w:val="15"/>
               </w:rPr>
-              <w:t>ebitda_per_t</w:t>
+              <w:t>k_uplift</w:t>
             </w:r>
           </w:p>
         </w:tc>
@@ -5747,7 +5747,7 @@
                 <w:color w:val="1C3A36"/>
                 <w:sz w:val="15"/>
               </w:rPr>
-              <w:t>40, 90, 115, 128, 135</w:t>
+              <w:t>1.387</w:t>
             </w:r>
           </w:p>
         </w:tc>
@@ -5781,7 +5781,7 @@
                 <w:color w:val="1C3A36"/>
                 <w:sz w:val="15"/>
               </w:rPr>
-              <w:t>Conversion EBITDA per tonne (k EGP/t). Historical: FY23 ~111k, FY24 ~145k (both near-full utilization WITH devaluation inventory gains), FY25 ~183k (copper-gain inflated), Q1-26 ~11k (under-absorption at ~40% utilization). Forecast recovers with utilization to 135k by FY30E — BELOW FY24's 145k nominal despite five years of EGP inflation, i.e. a ~30% real discount to the windfall; sensitized ±30%. CROSS-CHECK: as a share of realized price/t, the terminal 135/987 = 13.7% matches the PRE-windfall 2022 norm (~12% of price at 24.4kt implied full utilization) — the forecast returns the company to its pre-devaluation conversion economics, not to the windfall</w:t>
+              <w:t>Fabrication uplift: cable price per tonne / copper cost per tonne. Set from the industry norm that copper is ~70-75% of a power-cable price (IndexBox: LME 'directly and rapidly reflected' in quotations) =&gt; k = 1/0.72 = 1.39. VALIDATION, not calibration: FY24 revenue 13,778 at 9,147 x 45.3 x 1.387 = 574k EGP/t implies 24.0 kt — 96% of the stated 25 kt capacity in the sector's boom year. Sensitized ±5%</w:t>
             </w:r>
           </w:p>
         </w:tc>
@@ -5800,7 +5800,7 @@
                 <w:color w:val="1C3A36"/>
                 <w:sz w:val="15"/>
               </w:rPr>
-              <w:t>capex_mn</w:t>
+              <w:t>vols_fcst</w:t>
             </w:r>
           </w:p>
         </w:tc>
@@ -5817,7 +5817,7 @@
                 <w:color w:val="1C3A36"/>
                 <w:sz w:val="15"/>
               </w:rPr>
-              <w:t>225, 243, 262, 283, 306</w:t>
+              <w:t>10.4, 11.9, 13.4, 14.8, 16</w:t>
             </w:r>
           </w:p>
         </w:tc>
@@ -5851,7 +5851,7 @@
                 <w:color w:val="1C3A36"/>
                 <w:sz w:val="15"/>
               </w:rPr>
-              <w:t>Maintenance capex ~EGP 9k per tonne of capacity (25 kt), escalated ~8%/yr — no disclosed capex any year (flagged gap); FY24 D&amp;A ~0.7% of revenue corroborates a light fixed-asset base</w:t>
+              <w:t>Volumes (kt): Q1-26 implied ~2.4 kt/qtr sets the FY26E base (~42% utilization); recovery on EETC's EGP 45bn plan, the EU package and interconnector follow-on to ~64% utilization by FY30E — still below the FY23-24 near-full prints; sensitized ±15%</w:t>
             </w:r>
           </w:p>
         </w:tc>
@@ -5870,7 +5870,7 @@
                 <w:color w:val="1C3A36"/>
                 <w:sz w:val="15"/>
               </w:rPr>
-              <w:t>nwc_pct</w:t>
+              <w:t>ebitda_per_t</w:t>
             </w:r>
           </w:p>
         </w:tc>
@@ -5887,7 +5887,7 @@
                 <w:color w:val="1C3A36"/>
                 <w:sz w:val="15"/>
               </w:rPr>
-              <w:t>1.12, 1.06, 1, 0.94, 0.88</w:t>
+              <w:t>40, 90, 115, 128, 135</w:t>
             </w:r>
           </w:p>
         </w:tc>
@@ -5921,7 +5921,7 @@
                 <w:color w:val="1C3A36"/>
                 <w:sz w:val="15"/>
               </w:rPr>
-              <w:t>House: FY25 intensity ~117% of revenue (derived on disclosed debt) gliding to 88% as receivables collect and copper-inflated inventory normalises; FY24 was ~76% — full reversion NOT assumed; sensitized in the grid</w:t>
+              <w:t>Conversion EBITDA per tonne (k EGP/t). Historical: FY23 ~111k, FY24 ~145k (both near-full utilization WITH devaluation inventory gains), FY25 ~183k (copper-gain inflated), Q1-26 ~11k (under-absorption at ~40% utilization). Forecast recovers with utilization to 135k by FY30E — BELOW FY24's 145k nominal despite five years of EGP inflation, i.e. a ~30% real discount to the windfall; sensitized ±30%. CROSS-CHECK: as a share of realized price/t, the terminal 135/987 = 13.7% matches the PRE-windfall 2022 norm (~12% of price at 24.4kt implied full utilization) — the forecast returns the company to its pre-devaluation conversion economics, not to the windfall</w:t>
             </w:r>
           </w:p>
         </w:tc>
@@ -5940,7 +5940,7 @@
                 <w:color w:val="1C3A36"/>
                 <w:sz w:val="15"/>
               </w:rPr>
-              <w:t>beta</w:t>
+              <w:t>capex_mn</w:t>
             </w:r>
           </w:p>
         </w:tc>
@@ -5957,7 +5957,7 @@
                 <w:color w:val="1C3A36"/>
                 <w:sz w:val="15"/>
               </w:rPr>
-              <w:t>0.964</w:t>
+              <w:t>225, 243, 262, 283, 306</w:t>
             </w:r>
           </w:p>
         </w:tc>
@@ -5991,7 +5991,7 @@
                 <w:color w:val="1C3A36"/>
                 <w:sz w:val="15"/>
               </w:rPr>
-              <w:t>Own-stock tier-1 regression: ELEC weekly log-returns vs 30-name equal-weight EGX composite (full engine library), 5yr window: beta 0.964, R2 0.222, n=257, SE 0.113, CI90 [0.78, 1.15] — passes usability gate; NOT weak-flagged (R2&gt;10%, CI span &lt; 2x beta)</w:t>
+              <w:t>Maintenance capex ~EGP 9k per tonne of capacity (25 kt), escalated ~8%/yr — no disclosed capex any year (flagged gap); FY24 D&amp;A ~0.7% of revenue corroborates a light fixed-asset base</w:t>
             </w:r>
           </w:p>
         </w:tc>
@@ -6010,7 +6010,7 @@
                 <w:color w:val="1C3A36"/>
                 <w:sz w:val="15"/>
               </w:rPr>
-              <w:t>kd</w:t>
+              <w:t>nwc_pct</w:t>
             </w:r>
           </w:p>
         </w:tc>
@@ -6027,7 +6027,7 @@
                 <w:color w:val="1C3A36"/>
                 <w:sz w:val="15"/>
               </w:rPr>
-              <w:t>0.22</w:t>
+              <w:t>1.12, 1.06, 1, 0.94, 0.88</w:t>
             </w:r>
           </w:p>
         </w:tc>
@@ -6061,7 +6061,7 @@
                 <w:color w:val="1C3A36"/>
                 <w:sz w:val="15"/>
               </w:rPr>
-              <w:t>Marginal EGP rate for a levered EGX mid-cap: CBE corridor 19.5-20.0% (held 09-Jul-26) + ~2.5pp credit margin; consistent with avg bank lending 21.3% (Jan-26). Cross-checked against the two effective-rate computations below (23.5% FY24, 21.7% FY25 on the disclosed debt path). NB the Q1-26 P&amp;L implies a much smaller net finance line (~243/qtr) than Q1-25 (~542/qtr) — unexplained without the statements (possible FX/interest income offset or capitalised financing); flagged, does not change the marginal rate</w:t>
+              <w:t>House: FY25 intensity ~113% of revenue (triangulated balance sheet) gliding to 88% as receivables collect and copper-inflated inventory normalises; FY24 was ~76% — full reversion NOT assumed; sensitized in the grid</w:t>
             </w:r>
           </w:p>
         </w:tc>
@@ -6080,7 +6080,7 @@
                 <w:color w:val="1C3A36"/>
                 <w:sz w:val="15"/>
               </w:rPr>
-              <w:t>kd_eff_fy24</w:t>
+              <w:t>beta</w:t>
             </w:r>
           </w:p>
         </w:tc>
@@ -6097,7 +6097,7 @@
                 <w:color w:val="1C3A36"/>
                 <w:sz w:val="15"/>
               </w:rPr>
-              <w:t>0.235</w:t>
+              <w:t>0.964</w:t>
             </w:r>
           </w:p>
         </w:tc>
@@ -6131,7 +6131,7 @@
                 <w:color w:val="1C3A36"/>
                 <w:sz w:val="15"/>
               </w:rPr>
-              <w:t>Effective-rate check #1: FY24 interest ~1,700 (EBIT 3,400 / coverage 2.0x, SWS) / avg debt ~(5,500e+8,960)/2 = 7,230 =&gt; 23.5%</w:t>
+              <w:t>Own-stock tier-1 regression: ELEC weekly log-returns vs 30-name equal-weight EGX composite (full engine library), 5yr window: beta 0.964, R2 0.222, n=257, SE 0.113, CI90 [0.78, 1.15] — passes usability gate; NOT weak-flagged (R2&gt;10%, CI span &lt; 2x beta)</w:t>
             </w:r>
           </w:p>
         </w:tc>
@@ -6150,6 +6150,146 @@
                 <w:color w:val="1C3A36"/>
                 <w:sz w:val="15"/>
               </w:rPr>
+              <w:t>kd</w:t>
+            </w:r>
+          </w:p>
+        </w:tc>
+        <w:tc>
+          <w:tcPr>
+            <w:tcW w:type="dxa" w:w="1656"/>
+          </w:tcPr>
+          <w:p>
+            <w:pPr>
+              <w:spacing w:after="20"/>
+            </w:pPr>
+            <w:r>
+              <w:rPr>
+                <w:color w:val="1C3A36"/>
+                <w:sz w:val="15"/>
+              </w:rPr>
+              <w:t>0.22</w:t>
+            </w:r>
+          </w:p>
+        </w:tc>
+        <w:tc>
+          <w:tcPr>
+            <w:tcW w:type="dxa" w:w="1224"/>
+          </w:tcPr>
+          <w:p>
+            <w:pPr>
+              <w:spacing w:after="20"/>
+            </w:pPr>
+            <w:r>
+              <w:rPr>
+                <w:color w:val="1C3A36"/>
+                <w:sz w:val="15"/>
+              </w:rPr>
+              <w:t>2026-08-05</w:t>
+            </w:r>
+          </w:p>
+        </w:tc>
+        <w:tc>
+          <w:tcPr>
+            <w:tcW w:type="dxa" w:w="5544"/>
+          </w:tcPr>
+          <w:p>
+            <w:pPr>
+              <w:spacing w:after="20"/>
+            </w:pPr>
+            <w:r>
+              <w:rPr>
+                <w:color w:val="1C3A36"/>
+                <w:sz w:val="15"/>
+              </w:rPr>
+              <w:t>Marginal EGP rate for a levered EGX mid-cap: CBE corridor 19.5-20.0% (held 09-Jul-26) + ~2.5pp credit margin; consistent with avg bank lending 21.3% (Jan-26). Cross-checked against the two effective-rate computations below (23.5% FY24, 22.1% FY25 on the triangulated debt path). NB the Q1-26 P&amp;L implies a much smaller net finance line (~243/qtr) than Q1-25 (~542/qtr) — unexplained without the statements (possible FX/interest income offset or capitalised financing); flagged, does not change the marginal rate</w:t>
+            </w:r>
+          </w:p>
+        </w:tc>
+      </w:tr>
+      <w:tr>
+        <w:tc>
+          <w:tcPr>
+            <w:tcW w:type="dxa" w:w="1800"/>
+          </w:tcPr>
+          <w:p>
+            <w:pPr>
+              <w:spacing w:after="20"/>
+            </w:pPr>
+            <w:r>
+              <w:rPr>
+                <w:color w:val="1C3A36"/>
+                <w:sz w:val="15"/>
+              </w:rPr>
+              <w:t>kd_eff_fy24</w:t>
+            </w:r>
+          </w:p>
+        </w:tc>
+        <w:tc>
+          <w:tcPr>
+            <w:tcW w:type="dxa" w:w="1656"/>
+          </w:tcPr>
+          <w:p>
+            <w:pPr>
+              <w:spacing w:after="20"/>
+            </w:pPr>
+            <w:r>
+              <w:rPr>
+                <w:color w:val="1C3A36"/>
+                <w:sz w:val="15"/>
+              </w:rPr>
+              <w:t>0.235</w:t>
+            </w:r>
+          </w:p>
+        </w:tc>
+        <w:tc>
+          <w:tcPr>
+            <w:tcW w:type="dxa" w:w="1224"/>
+          </w:tcPr>
+          <w:p>
+            <w:pPr>
+              <w:spacing w:after="20"/>
+            </w:pPr>
+            <w:r>
+              <w:rPr>
+                <w:color w:val="1C3A36"/>
+                <w:sz w:val="15"/>
+              </w:rPr>
+              <w:t>2026-08-05</w:t>
+            </w:r>
+          </w:p>
+        </w:tc>
+        <w:tc>
+          <w:tcPr>
+            <w:tcW w:type="dxa" w:w="5544"/>
+          </w:tcPr>
+          <w:p>
+            <w:pPr>
+              <w:spacing w:after="20"/>
+            </w:pPr>
+            <w:r>
+              <w:rPr>
+                <w:color w:val="1C3A36"/>
+                <w:sz w:val="15"/>
+              </w:rPr>
+              <w:t>Effective-rate check #1: FY24 interest ~1,700 (EBIT 3,400 / coverage 2.0x, SWS) / avg debt ~(5,500e+8,960)/2 = 7,230 =&gt; 23.5%</w:t>
+            </w:r>
+          </w:p>
+        </w:tc>
+      </w:tr>
+      <w:tr>
+        <w:tc>
+          <w:tcPr>
+            <w:tcW w:type="dxa" w:w="1800"/>
+          </w:tcPr>
+          <w:p>
+            <w:pPr>
+              <w:spacing w:after="20"/>
+            </w:pPr>
+            <w:r>
+              <w:rPr>
+                <w:color w:val="1C3A36"/>
+                <w:sz w:val="15"/>
+              </w:rPr>
               <w:t>kd_eff_fy25</w:t>
             </w:r>
           </w:p>
@@ -6167,7 +6307,7 @@
                 <w:color w:val="1C3A36"/>
                 <w:sz w:val="15"/>
               </w:rPr>
-              <w:t>0.217</w:t>
+              <w:t>0.221</w:t>
             </w:r>
           </w:p>
         </w:tc>
@@ -6201,7 +6341,7 @@
                 <w:color w:val="1C3A36"/>
                 <w:sz w:val="15"/>
               </w:rPr>
-              <w:t>Effective-rate check #2: FY25 finance cost ~2,150 (derived, closes P&amp;L to reported NP; independently corroborated by Q1-25's implied ~542/qtr) / avg disclosed debt (8,960+10,900)/2 = 9,930 =&gt; 21.7%</w:t>
+              <w:t>Effective-rate check #2: FY25 finance cost ~2,150 (derived, closes P&amp;L to reported NP; independently corroborated by Q1-25's implied ~542/qtr) / avg debt (8,960 + triangulated 10,465)/2 = 9,713 =&gt; 22.1%</w:t>
             </w:r>
           </w:p>
         </w:tc>

</xml_diff>

<commit_message>
ELEC rev 5: external-audit response — copper re-anchored to market ($14k), ownership/peers corrected, all verified prose-model inconsistencies fixed, bull bridge and terminal-ROIC grid published
Co-Authored-By: Claude Fable 5 <noreply@anthropic.com>
Claude-Session: https://claude.ai/code/session_01WDB3U7m8U6NX4ju3RCn348
</commit_message>
<xml_diff>
--- a/engine/elec_study/ELEC_Source_Register_05-08-2026.docx
+++ b/engine/elec_study/ELEC_Source_Register_05-08-2026.docx
@@ -2081,7 +2081,7 @@
                 <w:color w:val="1C3A36"/>
                 <w:sz w:val="15"/>
               </w:rPr>
-              <w:t>50.3</w:t>
+              <w:t>49.8</w:t>
             </w:r>
           </w:p>
         </w:tc>
@@ -2115,7 +2115,7 @@
                 <w:color w:val="1C3A36"/>
                 <w:sz w:val="15"/>
               </w:rPr>
-              <w:t>USD/EGP mid-market (Bloomberg quote; bank avg ~51.0)</w:t>
+              <w:t>USD/EGP mid-market 49.765 (Xe/Google Finance, 05-Aug-26). NB the pound was NOT range-bound over the last year: 46.8 (Feb-26 strong side) to ~54.7 (Apr-26, war spike), back to ~49.8 — the prior 'range-bound 47-52' description was wrong and is corrected throughout</w:t>
             </w:r>
           </w:p>
         </w:tc>
@@ -2255,7 +2255,7 @@
                 <w:color w:val="1C3A36"/>
                 <w:sz w:val="15"/>
               </w:rPr>
-              <w:t>investing.com, Egypt 10Y local-currency govt bond yield, cached in-repo wacc_builder.py Egypt worked example; corroborated by the May-2026 window avg 21.3% (range 20.9-21.6)</w:t>
+              <w:t>investing.com, Egypt 10Y local-currency govt bond yield, 21-Jul-26 print (cached in-repo). Audit-checked: the credible early-Aug band is ~22.3-23.0% (Jul-26 3Y auction avg 23.32%; secondary prints 22.6-23.0 reported but unreachable at source) — the print sits at the LOW edge, worth ~-0.10/sh unfloored if the top of the band is right; May-26 window avg 21.29% (investing series) corroborates the level's vintage</w:t>
             </w:r>
           </w:p>
         </w:tc>
@@ -3879,7 +3879,7 @@
                 <w:color w:val="1C3A36"/>
                 <w:sz w:val="15"/>
               </w:rPr>
-              <w:t>9,000</w:t>
+              <w:t>8,960</w:t>
             </w:r>
           </w:p>
         </w:tc>
@@ -3896,7 +3896,7 @@
                 <w:color w:val="1C3A36"/>
                 <w:sz w:val="15"/>
               </w:rPr>
-              <w:t>2025-05-22</w:t>
+              <w:t>2026-03-18</w:t>
             </w:r>
           </w:p>
         </w:tc>
@@ -3913,7 +3913,7 @@
                 <w:color w:val="1C3A36"/>
                 <w:sz w:val="15"/>
               </w:rPr>
-              <w:t>Simply Wall St health page (total debt) — single aggregator, credible (its assets figure matches the twice-sourced 14.97bn)</w:t>
+              <w:t>Company's own FY25-filing comparative ('vs 8.96bn in 2024'); SWS independent print ~9.0bn corroborates. Standardized on the filing comparative so every FY24 net-debt reference in the study is the same number (8,132)</w:t>
             </w:r>
           </w:p>
         </w:tc>
@@ -4753,7 +4753,7 @@
                 <w:color w:val="1C3A36"/>
                 <w:sz w:val="15"/>
               </w:rPr>
-              <w:t>Annual production capacity ~25,000 t/yr — company profile via IATF exhibitor page; SINGLE-SOURCED and possibly parent-only (consolidated subsidiaries may add capacity), so utilization ratios are indicative, flagged</w:t>
+              <w:t>Annual production capacity ~25,000 t/yr at the PARENT's 370,000 sqm Mostorod plant (IATF exhibitor profile — audit-confirmed parent-only). The consolidated group adds Giza Power Industry's 81,745 sqm Abu Rawash plant (99.99%%-owned; company-stated range 1kV-220kV incl. XLPE HV; certification evidence reaches 33kV; tonnage NOT disclosed) — so group capacity exceeds 25kt by an unknown margin and every utilization ratio in this study is an UPPER BOUND on a parent-capacity basis</w:t>
             </w:r>
           </w:p>
         </w:tc>
@@ -5011,7 +5011,7 @@
                 <w:color w:val="1C3A36"/>
                 <w:sz w:val="15"/>
               </w:rPr>
-              <w:t>House estimate — bounded by 9M-23 disclosed 8,060 and FY24 14,970; no FY23 year-end print found (flagged)</w:t>
+              <w:t>House estimate — bounded by 9M-23 disclosed 8,060 and FY24 14,970; no FY23 year-end print found (flagged). A single aggregator shows ~8,900, which would put this estimate ~12%% high — affects only the FY23 ROIC context row, no valuation line</w:t>
             </w:r>
           </w:p>
         </w:tc>
@@ -5571,7 +5571,7 @@
                 <w:color w:val="1C3A36"/>
                 <w:sz w:val="15"/>
               </w:rPr>
-              <w:t>TRIANGULATED (rollforward_fy25.py, replacing the facilities-sentence reading 10,200): (A) balance-sheet residual — disclosed assets 16,460 less rolled equity 4,100 (FY24 3,600 + NP 500.3, no dividend) gives liabilities 12,360; less non-debt liabilities ~1,890 =&gt; drawn debt 10,465; less cash 665 =&gt; 9,802. (B) cash-flow roll-forward from FY24 ND 8,132 + interest 2,150 + tax 145 + capex 210 + dNWC ~2,036 - EBITDA 2,871 =&gt; 9,803 (shares the balance-sheet WC decomposition with A — agreement is consistency, not full independence). (C) facilities-as-drawn 10,235 = the upper cross-check. Range 9,120-10,360 carried in sensitivity (~±EGP 0.19/sh); the FY24-vintage low alternative 8,172 is REJECTED by the reverse test (needs non-debt liabilities +41% while purchases fell 21%). Falsifier: audited FY25 borrowings note</w:t>
+              <w:t>TRIANGULATED (rollforward_fy25.py, replacing the facilities-sentence reading 10,200): (A) balance-sheet residual — disclosed assets 16,460 less rolled equity 4,100 (FY24 3,600 + NP 500.3, no dividend) gives liabilities 12,360; less non-debt liabilities ~1,890 =&gt; drawn debt 10,465; less cash 665 =&gt; 9,802. (B) cash-flow roll-forward from FY24 ND 8,132 + interest 2,150 + tax 145 + capex 210 + dNWC ~2,036 - EBITDA 2,871 =&gt; 9,803 (shares the balance-sheet WC decomposition with A — agreement is consistency, not full independence). (C) facilities-as-drawn 10,235 = the upper cross-check. Range 9,120-10,360 carried in sensitivity (~±EGP 0.19/sh); the FY24-vintage low alternative 8,172 is REJECTED by the reverse test (needs non-debt liabilities +41% while purchases fell 21%). Falsifier: audited FY25 borrowings note. POST-AUDIT NOTE: two aggregator-side readings sit AT/ABOVE the range top — facilities-as-drawn 10,235, and an unverifiable D/E print (299.35%) implying ~11.4bn total debt / ~10.4bn net — so the residual risk on this anchor is SKEWED ADVERSE; the challenged 10,386 reading is explicitly sensitized</w:t>
             </w:r>
           </w:p>
         </w:tc>
@@ -5921,7 +5921,7 @@
                 <w:color w:val="1C3A36"/>
                 <w:sz w:val="15"/>
               </w:rPr>
-              <w:t>Conversion EBITDA per tonne (k EGP/t). Historical: FY23 ~111k, FY24 ~145k (both near-full utilization WITH devaluation inventory gains), FY25 ~183k (copper-gain inflated), Q1-26 ~11k (under-absorption at ~40% utilization). Forecast recovers with utilization to 135k by FY30E — BELOW FY24's 145k nominal despite five years of EGP inflation, i.e. a ~30% real discount to the windfall; sensitized ±30%. CROSS-CHECK: as a share of realized price/t, the terminal 135/987 = 13.7% matches the PRE-windfall 2022 norm (~12% of price at 24.4kt implied full utilization) — the forecast returns the company to its pre-devaluation conversion economics, not to the windfall</w:t>
+              <w:t>Conversion EBITDA per tonne (k EGP/t). Historical: FY23 ~111k, FY24 ~145k (both near-full utilization WITH devaluation inventory gains), FY25 ~183k (copper-gain inflated), Q1-26 ~11k (under-absorption at ~40% utilization). Forecast recovers with utilization to 135k by FY30E — BELOW FY24's 145k nominal despite five years of EGP inflation, i.e. a ~30% real discount to the windfall; sensitized ±30%. CROSS-CHECK: as a share of realized price/t at the $14k copper anchor, the terminal 135/1,097 = 12.3% matches the PRE-windfall 2022 norm (~12% of price at implied full utilization) — the forecast returns the company to its pre-devaluation conversion economics, not to the windfall</w:t>
             </w:r>
           </w:p>
         </w:tc>
@@ -6201,7 +6201,7 @@
                 <w:color w:val="1C3A36"/>
                 <w:sz w:val="15"/>
               </w:rPr>
-              <w:t>Marginal EGP rate for a levered EGX mid-cap: CBE corridor 19.5-20.0% (held 09-Jul-26) + ~2.5pp credit margin; consistent with avg bank lending 21.3% (Jan-26). Cross-checked against the two effective-rate computations below (23.5% FY24, 22.1% FY25 on the triangulated debt path). NB the Q1-26 P&amp;L implies a much smaller net finance line (~243/qtr) than Q1-25 (~542/qtr) — unexplained without the statements (possible FX/interest income offset or capitalised financing); flagged, does not change the marginal rate</w:t>
+              <w:t>Marginal EGP rate for a levered EGX mid-cap: CBE corridor 19.00/20.00% deposit/lending (main operation 19.50%; third consecutive hold 09-Jul-26 after the 100bp Feb-26 cut) + ~2.5pp credit margin; consistent with avg bank lending 21.3% (Jan-26). Cross-checked against the two effective-rate computations below (23.5% FY24, 22.1% FY25 on the triangulated debt path). NB the Q1-26 P&amp;L implies a much smaller net finance line (~243/qtr) than Q1-25 (~542/qtr) — unexplained without the statements (possible FX/interest income offset or capitalised financing); flagged, does not change the marginal rate</w:t>
             </w:r>
           </w:p>
         </w:tc>
@@ -6691,7 +6691,7 @@
                 <w:color w:val="1C3A36"/>
                 <w:sz w:val="15"/>
               </w:rPr>
-              <w:t>Forward Kd path: CBE easing resumes H2-26 (MPC 20-Aug/01-Oct/12-Nov-26) toward the 7%%-&gt;5%% inflation-target glide; corporate spread held ~3pp; terminal 15%%. The WACC glide shape is tied to this path by construction</w:t>
+              <w:t>Forward Kd path: FY26 held FLAT at 22%% — the CBE paused its easing cycle in Apr-26 ('wait-and-see', three consecutive holds through 09-Jul-26, inflation guided to accelerate through Q3-26 on base effects and energy price hikes) and the path resumes only from FY27 toward the 7%%-&gt;5%% inflation-target glide; corporate spread held ~3pp; terminal 15%%. Next MPC 20-Aug-26 (confirmed). A higher-for-longer path is the explicit +2pp column of the rate grid. The WACC glide shape is tied to this path by construction</w:t>
             </w:r>
           </w:p>
         </w:tc>

</xml_diff>